<commit_message>
Rewrite The Four Year Gap as a story, add the timeline graphic
Full rewrite after feedback that the first draft read as orthodox and AI
sounding. Dropped the "## Section" header structure for a continuous
first-person story: three independent story drafts, judged for humanness
and fidelity to the sourced facts, synthesized into one voice, then run
through two rounds of adversarial "does this still sound like AI" review
(four reviewers total across both rounds). Fixed a residual "here's why"
narrating tic, a mirrored closing sentence pair, one antithesis-shaped
line, two unsourced claims, and an internal four-years/five-years slip.

Added assets/four-year-gap-timeline.png (via new
scripts/make_four_year_gap_timeline.py, matching this repo's existing
chart palette) to visualize the Bled 2018 to ChatGPT 2022 to today to
2029 timeline the piece is built around.

Co-Authored-By: Claude Sonnet 5 <noreply@anthropic.com>
</commit_message>
<xml_diff>
--- a/articles/2026-08-08-the-four-year-gap.docx
+++ b/articles/2026-08-08-the-four-year-gap.docx
@@ -18,26 +18,12 @@
     </w:p>
     <w:p>
       <w:r>
-        <w:t>What a 2018 forum in Slovenia taught me about calling something decades away, and why quantum computing is due the same test.</w:t>
-      </w:r>
-    </w:p>
-    <w:p>
-      <w:pPr>
-        <w:pStyle w:val="Heading1"/>
-        <w:spacing w:before="280" w:after="80"/>
-      </w:pPr>
-      <w:r>
-        <w:rPr>
-          <w:rFonts w:ascii="Calibri" w:hAnsi="Calibri"/>
-          <w:color w:val="1F3A5F"/>
-          <w:sz w:val="30"/>
-        </w:rPr>
-        <w:t>The claim</w:t>
+        <w:t>A story about getting a timeline wrong once, and trying not to do it again.</w:t>
       </w:r>
     </w:p>
     <w:p>
       <w:r>
-        <w:t>In September 2018 I sat in a session on artificial intelligence at the Bled Strategic Forum, the annual conference the Slovenian government founded in 2006, held each September on the shore of Lake Bled, that brings government leaders, diplomats, academics, and media together to discuss global strategic issues (</w:t>
+        <w:t xml:space="preserve">In September 2018 I sat in a session on artificial intelligence at the Bled Strategic Forum. It's an annual conference the Slovenian government started in 2006, held every September on the shore of Lake Bled, where government leaders, diplomats, academics, and journalists sit in the same rooms and talk about what's coming next, according to </w:t>
       </w:r>
       <w:hyperlink r:id="rId9">
         <w:r>
@@ -49,7 +35,17 @@
         </w:r>
       </w:hyperlink>
       <w:r>
-        <w:t>). The session sounded like science fiction to me. I remember thinking it would not happen in my lifetime. Four years later, on November 30, 2022, the whole world got ChatGPT (</w:t>
+        <w:t>.</w:t>
+      </w:r>
+    </w:p>
+    <w:p>
+      <w:r>
+        <w:t>The AI panel sounded like science fiction to me. I remember thinking, pretty clearly, that none of it would happen in my lifetime.</w:t>
+      </w:r>
+    </w:p>
+    <w:p>
+      <w:r>
+        <w:t xml:space="preserve">Four years later, on November 30, 2022, the whole world got ChatGPT from </w:t>
       </w:r>
       <w:hyperlink r:id="rId10">
         <w:r>
@@ -61,27 +57,40 @@
         </w:r>
       </w:hyperlink>
       <w:r>
-        <w:t>). I had the same feeling a few months ago, listening to a podcast about quantum computing and the risk it poses to cryptography, and this time I did not wait to find out if my instinct was right again. Quantum computers are nowhere close to running a structural model better than a laptop today. The gap between sounding like science fiction and sounding normal keeps closing faster than engineers plan for, and the part of quantum computing that needs a firm's attention this year has nothing to do with speed. It is what quantum computing already means for the data an infrastructure firm is encrypting right now.</w:t>
-      </w:r>
-    </w:p>
-    <w:p>
-      <w:pPr>
-        <w:pStyle w:val="Heading1"/>
-        <w:spacing w:before="280" w:after="80"/>
-      </w:pPr>
-      <w:r>
-        <w:rPr>
-          <w:rFonts w:ascii="Calibri" w:hAnsi="Calibri"/>
-          <w:color w:val="1F3A5F"/>
-          <w:sz w:val="30"/>
-        </w:rPr>
-        <w:t>What happened</w:t>
+        <w:t>. I was wrong. Not a little wrong. Wrong in a way that has stayed with me since.</w:t>
       </w:r>
     </w:p>
     <w:p>
       <w:r>
-        <w:t>The podcast episode was about Q-Day, the point at which a quantum computer becomes powerful enough to break the encryption the internet runs on. Google set an internal deadline for that risk on March 25, 2026: full post quantum protection across its own systems by 2029, framed explicitly around adversaries recording encrypted traffic today so they can decrypt it once a capable machine exists (</w:t>
+        <w:t>*So much for that instinct.*</w:t>
       </w:r>
+    </w:p>
+    <w:p>
+      <w:r>
+        <w:t>I think about that a lot. Not because I feel foolish about the timeline. Everyone in that room got the timeline wrong. What stayed with me is what my own mind did. It heard something that sounded impossible and quietly filed it under not yet, not for me. Then it happened anyway, faster than almost anyone in that room seemed to expect.</w:t>
+      </w:r>
+    </w:p>
+    <w:p>
+      <w:r>
+        <w:t>I'm not telling you this to make myself look bad. A few months ago I got the exact same feeling again, and this time I actually noticed it happening.</w:t>
+      </w:r>
+    </w:p>
+    <w:p>
+      <w:r>
+        <w:t>I was listening to a podcast about quantum computing, specifically about the risk it poses to cryptography. Same feeling as Bled. Far away. Like it belonged to some other decade, not mine.</w:t>
+      </w:r>
+    </w:p>
+    <w:p>
+      <w:r>
+        <w:t>Except this time I didn't want to wait another four years to find out if my instinct was wrong again. I went and researched it. Here's what I found.</w:t>
+      </w:r>
+    </w:p>
+    <w:p>
+      <w:r>
+        <w:t>There's a name for the moment a quantum computer becomes powerful enough to break the encryption the internet runs on. People call it Q Day. Nobody knows exactly when it lands. But some of the people closest to the problem have started putting real dates on their own preparation, and that's what caught my attention.</w:t>
+      </w:r>
+    </w:p>
+    <w:p>
       <w:hyperlink r:id="rId11">
         <w:r>
           <w:rPr>
@@ -92,7 +101,17 @@
         </w:r>
       </w:hyperlink>
       <w:r>
-        <w:t>). The number behind that urgency traces to Google researcher Craig Gidney, who published a paper in May 2025 showing that a quantum computer with fewer than a million noisy qubits could factor a 2048 bit RSA key in under a week, a reduction of roughly twenty times from his own 2019 estimate of about 20 million qubits (</w:t>
+        <w:t xml:space="preserve"> put an actual date on its own version of that problem. On March 25, 2026, it set an internal deadline: full post quantum protection across its own systems by 2029.</w:t>
+      </w:r>
+    </w:p>
+    <w:p>
+      <w:r>
+        <w:t>The reasoning has nothing to do with when a working machine actually shows up. Someone can record encrypted traffic today, save it, and decrypt it later once a capable enough machine exists. Google calls that harvest now, decrypt later. Whatever you send today, someone might already be filing it away.</w:t>
+      </w:r>
+    </w:p>
+    <w:p>
+      <w:r>
+        <w:t xml:space="preserve">Craig Gidney, a researcher at Google, published a paper on </w:t>
       </w:r>
       <w:hyperlink r:id="rId12">
         <w:r>
@@ -104,8 +123,10 @@
         </w:r>
       </w:hyperlink>
       <w:r>
-        <w:t>). NIST finalized its first three post quantum encryption standards on August 13, 2024, FIPS 203, 204, and 205, and is urging organizations to start migrating now rather than wait for a fixed cutoff (</w:t>
+        <w:t xml:space="preserve"> in May 2025. It showed that a quantum computer with fewer than a million noisy qubits could factor a 2048 bit RSA key in under a week. Back in 2019, his own estimate for that job was about 20 million qubits. That's roughly a twenty times drop in six years. That's the wrong direction if you're the one relying on that encryption.</w:t>
       </w:r>
+    </w:p>
+    <w:p>
       <w:hyperlink r:id="rId13">
         <w:r>
           <w:rPr>
@@ -116,12 +137,32 @@
         </w:r>
       </w:hyperlink>
       <w:r>
-        <w:t>).</w:t>
+        <w:t xml:space="preserve"> finalized its first three post quantum encryption standards on August 13, 2024. It didn't attach a firm cutoff date. What it said instead was simple. Start migrating now. Don't wait for one.</w:t>
       </w:r>
     </w:p>
     <w:p>
       <w:r>
-        <w:t>That is the cryptography side, and it is close. The civil engineering side is much earlier and far less certain. A 2024 review of quantum computing in civil engineering identified real potential in three areas: optimization problems like construction scheduling and structural sizing, machine learning for structural health monitoring, and simulations like finite element analysis. The same review found that today's quantum hardware is still what researchers call NISQ, noisy and without error correction, and that solving problems at the scale of a real bridge or building may require millions of qubits and a fault tolerant machine that does not exist yet (</w:t>
+        <w:t>I work in this industry, and I don't want to hand you a scare piece.</w:t>
+      </w:r>
+    </w:p>
+    <w:p>
+      <w:r>
+        <w:t>Most AEC firms, the architecture, engineering, and construction industry, aren't defense contractors or banks. Nobody is telling a mid sized structural engineering firm to migrate its systems by a fixed date. Not yet. That's a real reason not to panic about this on a Monday morning. I still wouldn't wait for a client or an insurer to force the question.</w:t>
+      </w:r>
+    </w:p>
+    <w:p>
+      <w:r>
+        <w:t>The exposure starts the moment a capable quantum computer exists, whenever that turns out to be. That's what actually convinced me this matters, even for a firm like mine. Call that one clock. A separate, slower clock governs when quantum computers get good enough to actually be useful for engineering work. The risk clock starts ticking well before the usefulness clock does. I keep coming back to that. Not the exact year. The order things happen in.</w:t>
+      </w:r>
+    </w:p>
+    <w:p>
+      <w:r>
+        <w:t>*The cryptography risk is the one keeping me up. The building side of this is slower, and just as interesting.*</w:t>
+      </w:r>
+    </w:p>
+    <w:p>
+      <w:r>
+        <w:t xml:space="preserve">A 2024 review of quantum computing in civil engineering, published on </w:t>
       </w:r>
       <w:hyperlink r:id="rId14">
         <w:r>
@@ -133,45 +174,17 @@
         </w:r>
       </w:hyperlink>
       <w:r>
-        <w:t>). I do not think that timeline is close. I am fairly confident it is not decades away either, for the same reason 2018 taught me not to trust my own instinct about what counts as far off.</w:t>
-      </w:r>
-    </w:p>
-    <w:p>
-      <w:pPr>
-        <w:pStyle w:val="Heading1"/>
-        <w:spacing w:before="280" w:after="80"/>
-      </w:pPr>
-      <w:r>
-        <w:rPr>
-          <w:rFonts w:ascii="Calibri" w:hAnsi="Calibri"/>
-          <w:color w:val="1F3A5F"/>
-          <w:sz w:val="30"/>
-        </w:rPr>
-        <w:t>Why it matters to a firm like yours</w:t>
+        <w:t>, looked at where the real potential sits. Three places, mainly: optimization problems like construction scheduling and structural sizing, machine learning for structural health monitoring, and simulation for finite element analysis.</w:t>
       </w:r>
     </w:p>
     <w:p>
       <w:r>
-        <w:t>An AEC firm's real assets sit on both ends of a computing problem. On the output side, quantum computing is a long run bet on whether some of the heaviest computation a firm already pays for (topology optimization, materials simulation, network routing) gets cheaper or simply more thorough once the hardware matures. On the input side, the encrypted project data a firm holds today (geotechnical surveys, structural models, decades of proprietary IP, infrastructure control systems with long service lives) is already exposed to what security researchers call harvest now, decrypt later. An adversary records the encrypted traffic today and waits for a quantum computer capable of unlocking it later. That exposure begins the moment a capable quantum computer exists, which several serious estimates now place inside the working life of a project delivered today, long before quantum hardware becomes useful for the engineering work itself. The same leadership team deciding this year's AI tooling budget is, with far less fanfare, the one that will decide how much attention a cryptography migration gets before a client or an insurer forces the question.</w:t>
-      </w:r>
-    </w:p>
-    <w:p>
-      <w:pPr>
-        <w:pStyle w:val="Heading1"/>
-        <w:spacing w:before="280" w:after="80"/>
-      </w:pPr>
-      <w:r>
-        <w:rPr>
-          <w:rFonts w:ascii="Calibri" w:hAnsi="Calibri"/>
-          <w:color w:val="1F3A5F"/>
-          <w:sz w:val="30"/>
-        </w:rPr>
-        <w:t>The benefit case</w:t>
+        <w:t>Then the same review said the honest part out loud. Today's quantum hardware is still what people call NISQ. Noisy. No error correction yet. A problem at the scale of an actual bridge or building could need millions of qubits and a fault tolerant machine that doesn't exist yet.</w:t>
       </w:r>
     </w:p>
     <w:p>
       <w:r>
-        <w:t>Start with what quantum computing has already been tested against in the field. Volkswagen ran the most public pilot relevant to civil infrastructure: during Web Summit in Lisbon in November 2019, nine public buses run by the transit operator Carris used a routing system built on a D-Wave quantum computer to calculate near real time paths through city traffic, following an earlier demonstration of congestion free route optimization for taxis in Beijing in 2016 (</w:t>
+        <w:t xml:space="preserve">There is something real to point to, and it didn't stay in a lab. </w:t>
       </w:r>
       <w:hyperlink r:id="rId15">
         <w:r>
@@ -183,12 +196,12 @@
         </w:r>
       </w:hyperlink>
       <w:r>
-        <w:t>). That is traffic and network design, a core civil and urban planning problem, tested outside a lab rather than only inside one.</w:t>
+        <w:t xml:space="preserve"> ran the pilot that convinced me of that. During Web Summit in Lisbon in November 2019, nine public buses run by the transit operator Carris used a routing system built on a D-Wave quantum computer to calculate near real time paths through city traffic. Volkswagen had already tried something similar on taxis in Beijing back in 2016. Real buses, real streets. Small in scope. Still real.</w:t>
       </w:r>
     </w:p>
     <w:p>
       <w:r>
-        <w:t>Structural engineering has its own early research, and unlike most quantum computing papers today, this one reports a real head to head result. Researchers Zisheng Ye, Xiaoping Qian, and Wenxiao Pan split a classic structural optimization problem, finding the layout of material in a structure that minimizes how much it flexes under load, into a part solved on a normal computer and a smaller part solved on a D-Wave quantum annealer. The authors report, in their own abstract, that the hybrid method matched or outperformed standard classical heuristic methods on both solution quality and computational efficiency on the test problems they ran (</w:t>
+        <w:t xml:space="preserve">Closer to my own field, three researchers, Zisheng Ye, Xiaoping Qian, and Wenxiao Pan, took on a classic structural optimization problem: finding the layout of material in a structure that minimizes how much it flexes under load. They split it in two, solved the larger part on a normal computer, and the smaller part on a D-Wave quantum annealer. According to </w:t>
       </w:r>
       <w:hyperlink r:id="rId16">
         <w:r>
@@ -200,12 +213,12 @@
         </w:r>
       </w:hyperlink>
       <w:r>
-        <w:t>). I take that as a narrow, self-reported result on problems sized for a NISQ era machine. It supports a smaller claim than "quantum beats classical software on a real building": that a real structural design problem can be mapped onto quantum hardware and produce a usable answer at all, which is the harder problem to clear first. It is the first honest head to head data point I have found in this research, rather than another simulation of what might happen someday.</w:t>
+        <w:t>, the hybrid method matched or beat standard classical methods on the test problems they ran. I want to be careful here. That's a narrow, self reported result on small test cases. It's not proof that quantum computing beats good structural software on a real building. Still, someone actually ran the test and got a real number back.</w:t>
       </w:r>
     </w:p>
     <w:p>
       <w:r>
-        <w:t>Materials science may be the case with the clearest payoff if it holds up. Quantinuum's researchers have used quantum simulation to model how metal organic frameworks, a class of materials being actively researched for carbon capture, bind carbon dioxide molecules, the same kind of chemistry that matters for capturing emissions at the point they are produced (</w:t>
+        <w:t xml:space="preserve">There's a materials angle too, and it's the one that made me sit up. </w:t>
       </w:r>
       <w:hyperlink r:id="rId17">
         <w:r>
@@ -217,7 +230,7 @@
         </w:r>
       </w:hyperlink>
       <w:r>
-        <w:t>). Cement alone accounts for around 8 percent of global CO2 emissions, and the calcination process itself releases carbon dioxide as a matter of chemistry, on top of whatever the kiln burns for fuel (</w:t>
+        <w:t xml:space="preserve">'s researchers have used quantum simulation to model how metal organic frameworks, a class of material being actively researched for carbon capture, bind carbon dioxide molecules. Cement alone accounts for around 8 percent of global CO2 emissions, and a large share of that comes from the chemistry itself, the calcination process, according to </w:t>
       </w:r>
       <w:hyperlink r:id="rId18">
         <w:r>
@@ -229,106 +242,103 @@
         </w:r>
       </w:hyperlink>
       <w:r>
-        <w:t>). A materials scientist who can simulate binding energies accurately can start designing better sorbents with a modest quantum computer, well short of the fault tolerant machine that breaking encryption would require.</w:t>
+        <w:t>. If quantum simulation ever helps someone design a material that pulls that carbon out more cheaply, that's a story about what we build things out of, not about cybersecurity.</w:t>
+      </w:r>
+    </w:p>
+    <w:p>
+      <w:r>
+        <w:t>Where does that leave me. Honestly, in two different places at once.</w:t>
+      </w:r>
+    </w:p>
+    <w:p>
+      <w:r>
+        <w:t>I'm fairly confident about the cryptography risk. The math keeps moving one direction. Gidney's number keeps dropping. A company as careful as Google doesn't put a public date on something it isn't taking seriously. I don't know exactly when Q Day arrives. Nobody does. I don't think that's actually the question that matters most. What matters is whether your data is being copied today for someone to open later, once the machine exists to do it.</w:t>
+      </w:r>
+    </w:p>
+    <w:p>
+      <w:r>
+        <w:t>I honestly don't know yet whether the engineering case holds up. The hardware just isn't there. The buses in Lisbon and the beam problem Ye, Qian, and Pan solved are real, but they're small. Small signals take years to grow into something a project team would actually use.</w:t>
+      </w:r>
+    </w:p>
+    <w:p>
+      <w:r>
+        <w:t>Here's the one prediction I'll put my name on, dated, so you can check it yourself later. By December 31, 2027, at least one of the big global engineering and construction firms, companies like Arup, AECOM, Jacobs, WSP, Stantec, Mott MacDonald, or Ramboll, will have publicly disclosed a post quantum cryptography migration plan or timeline for its own systems, separate from some general AI or cybersecurity statement. My confidence in that is medium. I'd be surprised if none of them says anything by then.</w:t>
+      </w:r>
+    </w:p>
+    <w:p>
+      <w:r>
+        <w:t>*What I'm watching now.*</w:t>
+      </w:r>
+    </w:p>
+    <w:p>
+      <w:r>
+        <w:t>Two clocks, moving at very different speeds.</w:t>
       </w:r>
     </w:p>
     <w:p>
       <w:pPr>
-        <w:pStyle w:val="Heading1"/>
-        <w:spacing w:before="280" w:after="80"/>
+        <w:jc w:val="center"/>
+      </w:pPr>
+      <w:r>
+        <w:drawing>
+          <wp:inline xmlns:a="http://schemas.openxmlformats.org/drawingml/2006/main" xmlns:pic="http://schemas.openxmlformats.org/drawingml/2006/picture">
+            <wp:extent cx="5669280" cy="2576945"/>
+            <wp:docPr id="1" name="Picture 1"/>
+            <wp:cNvGraphicFramePr>
+              <a:graphicFrameLocks noChangeAspect="1"/>
+            </wp:cNvGraphicFramePr>
+            <a:graphic>
+              <a:graphicData uri="http://schemas.openxmlformats.org/drawingml/2006/picture">
+                <pic:pic>
+                  <pic:nvPicPr>
+                    <pic:cNvPr id="0" name="four-year-gap-timeline.png"/>
+                    <pic:cNvPicPr/>
+                  </pic:nvPicPr>
+                  <pic:blipFill>
+                    <a:blip r:embed="rId19"/>
+                    <a:stretch>
+                      <a:fillRect/>
+                    </a:stretch>
+                  </pic:blipFill>
+                  <pic:spPr>
+                    <a:xfrm>
+                      <a:off x="0" y="0"/>
+                      <a:ext cx="5669280" cy="2576945"/>
+                    </a:xfrm>
+                    <a:prstGeom prst="rect"/>
+                  </pic:spPr>
+                </pic:pic>
+              </a:graphicData>
+            </a:graphic>
+          </wp:inline>
+        </w:drawing>
+      </w:r>
+    </w:p>
+    <w:p>
+      <w:pPr>
+        <w:jc w:val="center"/>
       </w:pPr>
       <w:r>
         <w:rPr>
-          <w:rFonts w:ascii="Calibri" w:hAnsi="Calibri"/>
-          <w:color w:val="1F3A5F"/>
-          <w:sz w:val="30"/>
+          <w:i/>
+          <w:sz w:val="18"/>
         </w:rPr>
-        <w:t>The risk case</w:t>
+        <w:t>The four year gap: a timeline from the 2018 Bled Strategic Forum through ChatGPT's November 2022 launch, today's podcast moment, a December 2027 prediction, and Google's 2029 deadline to protect its systems from a capable quantum computer.</w:t>
       </w:r>
     </w:p>
     <w:p>
       <w:r>
-        <w:t>The honest risk sits opposite the benefit case in both certainty and timing. Every computational benefit above is still a proof that quantum hardware can be mapped onto a real engineering problem. Beating classical software at the scale a real bridge or building needs is a separate, larger claim the evidence does not support yet, and the estimates for when that changes keep moving. The cryptography risk depends on hardware that Google's own security team is now planning around arriving by 2029, three years from now, and breaking encryption only needs a quantum computer that is good at factoring large numbers, a far narrower machine than the one civil engineering would need (</w:t>
-      </w:r>
-      <w:hyperlink r:id="rId11">
-        <w:r>
-          <w:rPr>
-            <w:color w:val="0563C1"/>
-            <w:u w:val="single"/>
-          </w:rPr>
-          <w:t>Google</w:t>
-        </w:r>
-      </w:hyperlink>
-      <w:r>
-        <w:t>).</w:t>
+        <w:t>The fast one: whether any AEC firm follows Google's lead and puts an actual date on post quantum migration, instead of folding it into a vague paragraph about cybersecurity. That's the tell I'm looking for.</w:t>
       </w:r>
     </w:p>
     <w:p>
       <w:r>
-        <w:t>I hold what follows loosely, because no one, including the people building the hardware, has a confident date. But I am fairly confident the ordering matters more than the exact year: an infrastructure firm's monitoring networks, control systems, and archives of structural and geotechnical data are accumulating encrypted exposure today, years before quantum hardware for engineering computation is likely to be worth a firm's time. A firm that waits for quantum computing to become obviously useful before thinking about it at all will, by that same wait, also delay thinking about the part of this that is already a live risk. The counter case deserves a fair hearing. Most AEC firms are neither defense contractors nor banks, and the migration deadlines set so far target national security systems and federal agencies only, so treating this as an emergency ahead of any actual requirement risks spending real budget on a threat that is, for a mid sized structural firm, still fairly abstract. That is a reasonable position, and a different one from ignoring the question until a client or an insurer asks it first.</w:t>
-      </w:r>
-    </w:p>
-    <w:p>
-      <w:pPr>
-        <w:pStyle w:val="Heading1"/>
-        <w:spacing w:before="280" w:after="80"/>
-      </w:pPr>
-      <w:r>
-        <w:rPr>
-          <w:rFonts w:ascii="Calibri" w:hAnsi="Calibri"/>
-          <w:color w:val="1F3A5F"/>
-          <w:sz w:val="30"/>
-        </w:rPr>
-        <w:t>The throughline</w:t>
-      </w:r>
-    </w:p>
-    <w:p>
-      <w:pPr>
-        <w:pStyle w:val="IntenseQuote"/>
-      </w:pPr>
-      <w:r>
-        <w:t>The distance between something sounding like science fiction and something being normal keeps getting shorter, and the safest place to stand is tracking a new technology's risk case years before its benefit case is ready to use.</w:t>
-      </w:r>
-    </w:p>
-    <w:p>
-      <w:pPr>
-        <w:pStyle w:val="Heading1"/>
-        <w:spacing w:before="280" w:after="80"/>
-      </w:pPr>
-      <w:r>
-        <w:rPr>
-          <w:rFonts w:ascii="Calibri" w:hAnsi="Calibri"/>
-          <w:color w:val="1F3A5F"/>
-          <w:sz w:val="30"/>
-        </w:rPr>
-        <w:t>A prediction</w:t>
-      </w:r>
-    </w:p>
-    <w:p>
-      <w:pPr>
-        <w:pStyle w:val="IntenseQuote"/>
-      </w:pPr>
-      <w:r>
-        <w:t>Prediction (2026-08-08): By December 31, 2027, at least one firm from the top 20 global AEC firms by revenue (a group that includes Arup, AECOM, Jacobs, WSP, Stantec, Mott MacDonald, and Ramboll) will have publicly disclosed a post quantum cryptography migration plan or timeline for its own systems, distinct from a general AI or cybersecurity statement. Confidence: medium.</w:t>
-      </w:r>
-    </w:p>
-    <w:p>
-      <w:pPr>
-        <w:pStyle w:val="Heading1"/>
-        <w:spacing w:before="280" w:after="80"/>
-      </w:pPr>
-      <w:r>
-        <w:rPr>
-          <w:rFonts w:ascii="Calibri" w:hAnsi="Calibri"/>
-          <w:color w:val="1F3A5F"/>
-          <w:sz w:val="30"/>
-        </w:rPr>
-        <w:t>What I am watching next</w:t>
+        <w:t>Then there's the slower signal. I want to see whether quantum structural optimization work, like Ye, Qian, and Pan's, starts showing up on problems closer to the size of a real project instead of small test cases. If it does, the slow timeline is starting to compress too, the way the fast one did after Bled.</w:t>
       </w:r>
     </w:p>
     <w:p>
       <w:r>
-        <w:t>Two signals, on two different clocks. On the near clock, whether any AEC firm follows Google's lead and puts a specific post quantum migration date on the record, rather than folding it into a general cybersecurity paragraph, since that detail would tell me a firm has actually mapped its own exposure rather than noted the trend. On the far clock, whether results like Ye, Qian, and Pan's start showing up on structural problems closer to the scale a real project needs, rather than the small test cases quantum hardware can currently handle, since that is the signal that would tell me the multi year timeline I am assuming is starting to compress the way the AI timeline did after 2018.</w:t>
+        <w:t>I was wrong once about how much time I had to pay attention. I'd rather not be wrong twice.</w:t>
       </w:r>
     </w:p>
     <w:sectPr>

</xml_diff>

<commit_message>
Add quantum explainer, broaden past AEC framing, swap in a concrete graphic
Per feedback: added a plain paragraph explaining what a quantum computer
actually is (bits vs qubits, why it searches many answers at once);
pulled back the AEC-specific business framing in favor of general
engineering language, since the piece read too narrowly tied to AEC firm
consulting decisions; replaced the timeline graphic, which didn't convey
real information, with a three-card graphic showing the actual engineering
problem, where it was tried, and its status today for each of the three
cases the piece describes (traffic routing, structural design, carbon
capture materials).

Also ran a fresh pass against the "no-ai-slop" rubric and fixed the
patterns it caught: fragment-stacking, a few "not X" constructions,
a self-answered question, a throat-clearing opener, and a colon-reveal.

Co-Authored-By: Claude Sonnet 5 <noreply@anthropic.com>
</commit_message>
<xml_diff>
--- a/articles/2026-08-08-the-four-year-gap.docx
+++ b/articles/2026-08-08-the-four-year-gap.docx
@@ -82,7 +82,12 @@
     </w:p>
     <w:p>
       <w:r>
-        <w:t>Except this time I didn't want to wait another four years to find out if my instinct was wrong again. I went and researched it. Here's what I found.</w:t>
+        <w:t>Except this time I didn't want to wait another four years to find out if my instinct was wrong again, so I went and researched it.</w:t>
+      </w:r>
+    </w:p>
+    <w:p>
+      <w:r>
+        <w:t>A quick, honest explanation first, since I had to look this up myself before any of the rest of it made sense to me. A normal computer stores information as bits, each one a plain 0 or 1. A quantum computer uses qubits, which can hold a mix of 0 and 1 at once, and can be linked together so that changing one instantly affects the others. That lets it explore many possible answers to a problem at the same time instead of checking them one by one. It isn't simply a faster laptop. It's a different way of searching for an answer, and it mainly helps with problems where the number of possible answers explodes as the problem grows, like the fastest route through a city's traffic, or the best layout for material inside a beam.</w:t>
       </w:r>
     </w:p>
     <w:p>
@@ -137,7 +142,7 @@
         </w:r>
       </w:hyperlink>
       <w:r>
-        <w:t xml:space="preserve"> finalized its first three post quantum encryption standards on August 13, 2024. It didn't attach a firm cutoff date. What it said instead was simple. Start migrating now. Don't wait for one.</w:t>
+        <w:t xml:space="preserve"> finalized its first three post quantum encryption standards on August 13, 2024. It didn't attach a firm cutoff date. What it said instead was simple: start migrating now, rather than wait for one to be set.</w:t>
       </w:r>
     </w:p>
     <w:p>
@@ -147,17 +152,22 @@
     </w:p>
     <w:p>
       <w:r>
-        <w:t>Most AEC firms, the architecture, engineering, and construction industry, aren't defense contractors or banks. Nobody is telling a mid sized structural engineering firm to migrate its systems by a fixed date. Not yet. That's a real reason not to panic about this on a Monday morning. I still wouldn't wait for a client or an insurer to force the question.</w:t>
+        <w:t>Most of us in engineering aren't defense contractors or banks. Nobody is telling an engineering firm to migrate its systems by a fixed date. Not yet. That's a real reason not to panic about this on a Monday morning. I still wouldn't wait for a client or an insurer to force the question.</w:t>
       </w:r>
     </w:p>
     <w:p>
       <w:r>
-        <w:t>The exposure starts the moment a capable quantum computer exists, whenever that turns out to be. That's what actually convinced me this matters, even for a firm like mine. Call that one clock. A separate, slower clock governs when quantum computers get good enough to actually be useful for engineering work. The risk clock starts ticking well before the usefulness clock does. I keep coming back to that. Not the exact year. The order things happen in.</w:t>
+        <w:t>The exposure starts the moment a capable quantum computer exists, whenever that turns out to be. That's what actually convinced me this matters, even for someone like me. Call that one clock. A separate, slower clock governs when quantum computers get good enough to actually be useful for engineering work itself. The risk clock starts ticking well before the usefulness clock does. It's the order things happen in, not the exact year, that I keep coming back to.</w:t>
       </w:r>
     </w:p>
     <w:p>
       <w:r>
         <w:t>*The cryptography risk is the one keeping me up. The building side of this is slower, and just as interesting.*</w:t>
+      </w:r>
+    </w:p>
+    <w:p>
+      <w:r>
+        <w:t>This part isn't really about firms protecting old files anymore. It's about what quantum computing might eventually let us design, build, and fix in the physical world around us: the roads we drive on, the bridges we cross, the materials our buildings are made of.</w:t>
       </w:r>
     </w:p>
     <w:p>
@@ -179,7 +189,7 @@
     </w:p>
     <w:p>
       <w:r>
-        <w:t>Then the same review said the honest part out loud. Today's quantum hardware is still what people call NISQ. Noisy. No error correction yet. A problem at the scale of an actual bridge or building could need millions of qubits and a fault tolerant machine that doesn't exist yet.</w:t>
+        <w:t>Then the same review said the honest part out loud. Today's quantum hardware is still what people call NISQ, noisy and without error correction yet. A problem at the scale of an actual bridge or building could need millions of qubits and a fault tolerant machine that doesn't exist yet.</w:t>
       </w:r>
     </w:p>
     <w:p>
@@ -196,7 +206,7 @@
         </w:r>
       </w:hyperlink>
       <w:r>
-        <w:t xml:space="preserve"> ran the pilot that convinced me of that. During Web Summit in Lisbon in November 2019, nine public buses run by the transit operator Carris used a routing system built on a D-Wave quantum computer to calculate near real time paths through city traffic. Volkswagen had already tried something similar on taxis in Beijing back in 2016. Real buses, real streets. Small in scope. Still real.</w:t>
+        <w:t xml:space="preserve"> ran the pilot that convinced me of that. During Web Summit in Lisbon in November 2019, nine public buses run by the transit operator Carris used a routing system built on a D-Wave quantum computer to calculate near real time paths through city traffic. Volkswagen had already tried something similar on taxis in Beijing back in 2016. Real buses on real streets, small in scope, still real.</w:t>
       </w:r>
     </w:p>
     <w:p>
@@ -242,17 +252,68 @@
         </w:r>
       </w:hyperlink>
       <w:r>
-        <w:t>. If quantum simulation ever helps someone design a material that pulls that carbon out more cheaply, that's a story about what we build things out of, not about cybersecurity.</w:t>
+        <w:t>. If quantum simulation ever helps someone design a material that pulls that carbon out more cheaply, that's a story about what we build things out of.</w:t>
+      </w:r>
+    </w:p>
+    <w:p>
+      <w:pPr>
+        <w:jc w:val="center"/>
+      </w:pPr>
+      <w:r>
+        <w:drawing>
+          <wp:inline xmlns:a="http://schemas.openxmlformats.org/drawingml/2006/main" xmlns:pic="http://schemas.openxmlformats.org/drawingml/2006/picture">
+            <wp:extent cx="5669280" cy="3131980"/>
+            <wp:docPr id="1" name="Picture 1"/>
+            <wp:cNvGraphicFramePr>
+              <a:graphicFrameLocks noChangeAspect="1"/>
+            </wp:cNvGraphicFramePr>
+            <a:graphic>
+              <a:graphicData uri="http://schemas.openxmlformats.org/drawingml/2006/picture">
+                <pic:pic>
+                  <pic:nvPicPr>
+                    <pic:cNvPr id="0" name="quantum-engineering-cases.png"/>
+                    <pic:cNvPicPr/>
+                  </pic:nvPicPr>
+                  <pic:blipFill>
+                    <a:blip r:embed="rId19"/>
+                    <a:stretch>
+                      <a:fillRect/>
+                    </a:stretch>
+                  </pic:blipFill>
+                  <pic:spPr>
+                    <a:xfrm>
+                      <a:off x="0" y="0"/>
+                      <a:ext cx="5669280" cy="3131980"/>
+                    </a:xfrm>
+                    <a:prstGeom prst="rect"/>
+                  </pic:spPr>
+                </pic:pic>
+              </a:graphicData>
+            </a:graphic>
+          </wp:inline>
+        </w:drawing>
+      </w:r>
+    </w:p>
+    <w:p>
+      <w:pPr>
+        <w:jc w:val="center"/>
+      </w:pPr>
+      <w:r>
+        <w:rPr>
+          <w:i/>
+          <w:sz w:val="18"/>
+        </w:rPr>
+        <w:t>Three engineering problems already being tested against quantum computers: routing traffic in Lisbon with Volkswagen and D-Wave, designing structures with a hybrid classical and quantum annealer, and capturing carbon with Quantinuum's simulation of how metal organic frameworks bind CO2. All three are small scale results, not yet faster than classical software.</w:t>
       </w:r>
     </w:p>
     <w:p>
       <w:r>
-        <w:t>Where does that leave me. Honestly, in two different places at once.</w:t>
+        <w:t>That leaves me in two different places at once.</w:t>
       </w:r>
     </w:p>
     <w:p>
       <w:r>
-        <w:t>I'm fairly confident about the cryptography risk. The math keeps moving one direction. Gidney's number keeps dropping. A company as careful as Google doesn't put a public date on something it isn't taking seriously. I don't know exactly when Q Day arrives. Nobody does. I don't think that's actually the question that matters most. What matters is whether your data is being copied today for someone to open later, once the machine exists to do it.</w:t>
+        <w:t>I'm fairly confident about the cryptography risk. The math keeps moving one direction. Gidney's number keeps dropping. A company as careful as Google doesn't put a public date on something it isn't taking seriously. I don't know exactly when Q Day arrives. Nobody does. What matters more is whether your data is being copied today for someone to open later, once the machine exists to do it.</w:t>
       </w:r>
     </w:p>
     <w:p>
@@ -272,63 +333,7 @@
     </w:p>
     <w:p>
       <w:r>
-        <w:t>Two clocks, moving at very different speeds.</w:t>
-      </w:r>
-    </w:p>
-    <w:p>
-      <w:pPr>
-        <w:jc w:val="center"/>
-      </w:pPr>
-      <w:r>
-        <w:drawing>
-          <wp:inline xmlns:a="http://schemas.openxmlformats.org/drawingml/2006/main" xmlns:pic="http://schemas.openxmlformats.org/drawingml/2006/picture">
-            <wp:extent cx="5669280" cy="2576945"/>
-            <wp:docPr id="1" name="Picture 1"/>
-            <wp:cNvGraphicFramePr>
-              <a:graphicFrameLocks noChangeAspect="1"/>
-            </wp:cNvGraphicFramePr>
-            <a:graphic>
-              <a:graphicData uri="http://schemas.openxmlformats.org/drawingml/2006/picture">
-                <pic:pic>
-                  <pic:nvPicPr>
-                    <pic:cNvPr id="0" name="four-year-gap-timeline.png"/>
-                    <pic:cNvPicPr/>
-                  </pic:nvPicPr>
-                  <pic:blipFill>
-                    <a:blip r:embed="rId19"/>
-                    <a:stretch>
-                      <a:fillRect/>
-                    </a:stretch>
-                  </pic:blipFill>
-                  <pic:spPr>
-                    <a:xfrm>
-                      <a:off x="0" y="0"/>
-                      <a:ext cx="5669280" cy="2576945"/>
-                    </a:xfrm>
-                    <a:prstGeom prst="rect"/>
-                  </pic:spPr>
-                </pic:pic>
-              </a:graphicData>
-            </a:graphic>
-          </wp:inline>
-        </w:drawing>
-      </w:r>
-    </w:p>
-    <w:p>
-      <w:pPr>
-        <w:jc w:val="center"/>
-      </w:pPr>
-      <w:r>
-        <w:rPr>
-          <w:i/>
-          <w:sz w:val="18"/>
-        </w:rPr>
-        <w:t>The four year gap: a timeline from the 2018 Bled Strategic Forum through ChatGPT's November 2022 launch, today's podcast moment, a December 2027 prediction, and Google's 2029 deadline to protect its systems from a capable quantum computer.</w:t>
-      </w:r>
-    </w:p>
-    <w:p>
-      <w:r>
-        <w:t>The fast one: whether any AEC firm follows Google's lead and puts an actual date on post quantum migration, instead of folding it into a vague paragraph about cybersecurity. That's the tell I'm looking for.</w:t>
+        <w:t>Two clocks, moving at very different speeds. On the fast one, I'm watching whether any engineering firm follows Google's lead and puts an actual date on post quantum migration, instead of folding it into a vague paragraph about cybersecurity. That's the tell I'm looking for.</w:t>
       </w:r>
     </w:p>
     <w:p>

</xml_diff>